<commit_message>
fixing word structure and layout bug
</commit_message>
<xml_diff>
--- a/frontend/public/template-soal.docx
+++ b/frontend/public/template-soal.docx
@@ -54,6 +54,11 @@
       </w:r>
     </w:p>
     <w:p>
+      <w:r>
+        <w:t>Point: 10</w:t>
+      </w:r>
+    </w:p>
+    <w:p>
       <w:pPr>
         <w:pStyle w:val="Heading2"/>
       </w:pPr>
@@ -84,6 +89,11 @@
     <w:p>
       <w:r>
         <w:t>D. 9</w:t>
+      </w:r>
+    </w:p>
+    <w:p>
+      <w:r>
+        <w:t>Poin: 20</w:t>
       </w:r>
     </w:p>
     <w:p>
@@ -124,6 +134,11 @@
     </w:p>
     <w:p>
       <w:r/>
+    </w:p>
+    <w:p>
+      <w:r>
+        <w:t>Point: 15</w:t>
+      </w:r>
     </w:p>
     <w:p>
       <w:r>

</xml_diff>